<commit_message>
feat: Implement domain-specific reliability and research-backed probability sync (Gartner/LangChain)
</commit_message>
<xml_diff>
--- a/public/AI-Strategic-Brief-V2-Data.docx
+++ b/public/AI-Strategic-Brief-V2-Data.docx
@@ -16205,7 +16205,7 @@
                 <w:szCs w:val="52"/>
                 <w:rtl w:val="0"/>
               </w:rPr>
-              <w:t xml:space="preserve">~25%</w:t>
+              <w:t xml:space="preserve">~18%</w:t>
             </w:r>
             <w:r>
               <w:rPr>
@@ -16313,7 +16313,7 @@
                 <w:szCs w:val="52"/>
                 <w:rtl w:val="0"/>
               </w:rPr>
-              <w:t xml:space="preserve">~55%</w:t>
+              <w:t xml:space="preserve">~60%</w:t>
             </w:r>
             <w:r>
               <w:rPr>
@@ -16421,7 +16421,7 @@
                 <w:szCs w:val="52"/>
                 <w:rtl w:val="0"/>
               </w:rPr>
-              <w:t xml:space="preserve">~20%</w:t>
+              <w:t xml:space="preserve">~22%</w:t>
             </w:r>
             <w:r>
               <w:rPr>
@@ -16546,7 +16546,7 @@
                 <w:szCs w:val="20"/>
                 <w:rtl w:val="0"/>
               </w:rPr>
-              <w:t xml:space="preserve">Weights are informed by five inputs: (1) ARC-AGI-2/3 progress rates and benchmark saturation history, (2) inference cost curve trajectory (Stanford AI Index, Epoch AI), (3) BLS and Stanford/Harvard labour market data, (4) open-source model capability trajectory, and (5) LangChain State of AI Agents survey (1,300+ practitioners, 2026). The 55% Base Case weight reflects the view that the compounding mechanisms are real and directional, but that systems design diffusion is slower than capability improvement — creating a 12–24 month lag between frontier capability and broad enterprise reliability. These are informed estimates, not model outputs.</w:t>
+              <w:t xml:space="preserve">Weights are informed by six inputs: (1) ARC-AGI-2/3 progress rates and benchmark saturation history, (2) inference cost curve trajectory (Stanford AI Index, Epoch AI), (3) BLS and Stanford/Harvard labour market data, (4) open-source model capability trajectory, (5) LangChain State of AI Agents survey (1,300+ practitioners, 2026), and (6) enterprise adoption signals (Gartner March 2026; Databricks multi-agent growth data). The 60% Base Case weight reflects that both the capability trajectory (SWE-bench Pro roughly doubling in 12 months, from ~23% to 45.9% SEAL) and the adoption signals (57% of practitioners with agents in production; Gartner projecting 40% of enterprise applications embedding agentic capabilities by EOY 2026, up from 12% in 2025) are tracking the Base Case path, while the persistent quality barrier — cited as the #1 production blocker by 32% of respondents, consistent across two annual LangChain surveys — prevents this from being the Accelerated scenario. The Conservative weight is revised down to 18% (from 25%) because the dual-stall condition it requires — capability plateau below 45% SEAL and adoption diffusion reversal — is increasingly inconsistent with observed data on both sides. The adoption-side inputs (inputs 5 and 6) are new to V2.5 and anchor the distribution with supply-side and demand-side data simultaneously. These are informed estimates, not model outputs.</w:t>
             </w:r>
             <w:r>
               <w:rPr>
@@ -16759,7 +16759,7 @@
                 <w:szCs w:val="19"/>
                 <w:rtl w:val="0"/>
               </w:rPr>
-              <w:t xml:space="preserve">~25% probability</w:t>
+              <w:t xml:space="preserve">~18% probability</w:t>
             </w:r>
             <w:r>
               <w:rPr>
@@ -16797,7 +16797,7 @@
                 <w:szCs w:val="19"/>
                 <w:rtl w:val="0"/>
               </w:rPr>
-              <w:t xml:space="preserve">~55% probability</w:t>
+              <w:t xml:space="preserve">~60% probability</w:t>
             </w:r>
             <w:r>
               <w:rPr>
@@ -16835,7 +16835,7 @@
                 <w:szCs w:val="19"/>
                 <w:rtl w:val="0"/>
               </w:rPr>
-              <w:t xml:space="preserve">~20% probability</w:t>
+              <w:t xml:space="preserve">~22% probability</w:t>
             </w:r>
             <w:r>
               <w:rPr>

</xml_diff>

<commit_message>
Update data doc, formatting issue
</commit_message>
<xml_diff>
--- a/public/AI-Strategic-Brief-V2-Data.docx
+++ b/public/AI-Strategic-Brief-V2-Data.docx
@@ -11142,6 +11142,42 @@
           </w:p>
         </w:tc>
       </w:tr>
+    </w:tbl>
+    <w:p w14:paraId="0000013A1">
+      <w:pPr>
+        <w:spacing w:after="100" w:lineRule="auto"/>
+        <w:rPr/>
+      </w:pPr>
+      <w:r>
+        <w:rPr>
+          <w:rtl w:val="0"/>
+        </w:rPr>
+      </w:r>
+    </w:p>
+    <w:tbl>
+      <w:tblPr>
+        <w:tblStyle w:val="Table2"/>
+        <w:tblW w:w="9360.0" w:type="dxa"/>
+        <w:jc w:val="left"/>
+        <w:tblBorders>
+          <w:top w:color="000000" w:space="0" w:sz="4" w:val="single"/>
+          <w:left w:color="000000" w:space="0" w:sz="4" w:val="single"/>
+          <w:bottom w:color="000000" w:space="0" w:sz="4" w:val="single"/>
+          <w:right w:color="000000" w:space="0" w:sz="4" w:val="single"/>
+          <w:insideH w:color="000000" w:space="0" w:sz="4" w:val="single"/>
+          <w:insideV w:color="000000" w:space="0" w:sz="4" w:val="single"/>
+        </w:tblBorders>
+        <w:tblLayout w:type="fixed"/>
+        <w:tblLook w:val="0000"/>
+      </w:tblPr>
+      <w:tblGrid>
+        <w:gridCol w:w="9360"/>
+        <w:tblGridChange w:id="0">
+          <w:tblGrid>
+            <w:gridCol w:w="9360"/>
+          </w:tblGrid>
+        </w:tblGridChange>
+      </w:tblGrid>
       <w:tr>
         <w:trPr>
           <w:cantSplit w:val="0"/>
@@ -11199,7 +11235,7 @@
                 <w:szCs w:val="20"/>
                 <w:rtl w:val="0"/>
               </w:rPr>
-              <w:t xml:space="preserve">SWE-bench Pro measures patch quality — can the AI write code that passes tests? Terminal-Bench 2.0 measures operational execution — can the AI actually run a terminal, navigate a real environment, use tools, and complete a task end-to-end? These are different capabilities and the scores diverge accordingly.The same model scores differently depending on the agent wrapping it: scaffolding quality contributes 2–6 percentage points above raw model capability on Terminal-Bench 2.0. This is the cleanest public demonstration of the base-vs-whole-system gap for the Execution dimension — and is why the Execution inner/outer track gap on the spider chart is real and measurable, not inferred.</w:t>
+              <w:t xml:space="preserve">SWE-bench Pro measures patch quality — can the AI write code that passes tests? Terminal-Bench 2.0 measures operational execution — can the AI actually run a terminal, navigate a real environment, use tools, and complete a task end-to-end? These are different capabilities and the scores diverge accordingly. The same model scores differently depending on the agent wrapping it: scaffolding quality contributes 2–6 percentage points above raw model capability on Terminal-Bench 2.0. This is the cleanest public demonstration of the base-vs-whole-system gap for the Execution dimension — and is why the Execution inner/outer track gap on the spider chart is real and measurable, not inferred.</w:t>
             </w:r>
             <w:r>
               <w:rPr>

</xml_diff>

<commit_message>
docs: expand README.md and ensure content parity with the April 2026 AI strategic report
</commit_message>
<xml_diff>
--- a/public/AI-Strategic-Brief-V2-Data.docx
+++ b/public/AI-Strategic-Brief-V2-Data.docx
@@ -5605,7 +5605,7 @@
           <w:szCs w:val="22"/>
           <w:rtl w:val="0"/>
         </w:rPr>
-        <w:t xml:space="preserve">The Barbell Economy thesis — introduced in V1 with 60% probability — is now validated by hard data across multiple independent sources. Confidence is revised upward to &gt;85%. Three new developments since V1 add important nuance: the sector divergence between enterprise and startup hiring, the Klarna counter-pattern showing the correction loop, and the pipeline problem as a second-order risk.</w:t>
+        <w:t xml:space="preserve">The Barbell Economy thesis — introduced in V1 with 60% probability — is now validated by hard data across multiple independent sources. Confidence is revised upward to &gt;85%. Three new developments since V1 add important nuance: the sector divergence between enterprise and startup hiring, the Klarna counter-pattern showing the correction loop, and the pipeline problem as a second-order risk. One structural clarification on the barbell metaphor: the shape is now asymmetric rather than a true barbell — the bottom weight (junior and entry-level hiring) is actively collapsing rather than holding its position, while the top weight (senior and specialist demand) remains heavy, making the load one-sided rather than balanced.</w:t>
       </w:r>
       <w:r>
         <w:rPr>
@@ -23563,7 +23563,7 @@
                 <w:szCs w:val="18"/>
                 <w:rtl w:val="0"/>
               </w:rPr>
-              <w:t xml:space="preserve">Revelio Labs: 62M workers, 285K firms; 'seniority-biased technological change'</w:t>
+              <w:t xml:space="preserve">Revelio Labs: 62M workers, 285K firms; 'seniority-biased technological change'. Note: mid-level compression is an inference from the seniority-biased finding, not a directly measured data point — the paper identifies AI-adopting firms shift hiring toward senior workers, from which compression of mid-tier roles is inferred rather than independently observed.</w:t>
             </w:r>
             <w:r>
               <w:rPr>
@@ -26977,6 +26977,173 @@
                 <w:rtl w:val="0"/>
               </w:rPr>
               <w:t xml:space="preserve">47% of enterprise users made major decisions on hallucinated content</w:t>
+            </w:r>
+            <w:r>
+              <w:rPr>
+                <w:rtl w:val="0"/>
+              </w:rPr>
+            </w:r>
+          </w:p>
+        </w:tc>
+      </w:tr>
+      <w:tr>
+        <w:trPr>
+          <w:cantSplit w:val="0"/>
+          <w:tblHeader w:val="0"/>
+        </w:trPr>
+        <w:tc>
+          <w:tcPr>
+            <w:tcBorders>
+              <w:top w:color="cbd5e1" w:space="0" w:sz="4" w:val="single"/>
+              <w:left w:color="cbd5e1" w:space="0" w:sz="4" w:val="single"/>
+              <w:bottom w:color="cbd5e1" w:space="0" w:sz="4" w:val="single"/>
+              <w:right w:color="cbd5e1" w:space="0" w:sz="4" w:val="single"/>
+            </w:tcBorders>
+            <w:shd w:fill="f3f4f6" w:val="clear"/>
+            <w:tcMar>
+              <w:top w:w="80.0" w:type="dxa"/>
+              <w:left w:w="120.0" w:type="dxa"/>
+              <w:bottom w:w="80.0" w:type="dxa"/>
+              <w:right w:w="120.0" w:type="dxa"/>
+            </w:tcMar>
+          </w:tcPr>
+          <w:p>
+            <w:pPr>
+              <w:spacing w:after="0" w:lineRule="auto"/>
+              <w:rPr/>
+            </w:pPr>
+            <w:r>
+              <w:rPr>
+                <w:rFonts w:ascii="Arial" w:cs="Arial" w:eastAsia="Arial" w:hAnsi="Arial"/>
+                <w:b w:val="0"/>
+                <w:bCs w:val="0"/>
+                <w:color w:val="64748b"/>
+                <w:sz w:val="18"/>
+                <w:szCs w:val="18"/>
+                <w:rtl w:val="0"/>
+              </w:rPr>
+              <w:t xml:space="preserve">Legal / Reliability</w:t>
+            </w:r>
+            <w:r>
+              <w:rPr>
+                <w:rtl w:val="0"/>
+              </w:rPr>
+            </w:r>
+          </w:p>
+        </w:tc>
+        <w:tc>
+          <w:tcPr>
+            <w:tcBorders>
+              <w:top w:color="cbd5e1" w:space="0" w:sz="4" w:val="single"/>
+              <w:left w:color="cbd5e1" w:space="0" w:sz="4" w:val="single"/>
+              <w:bottom w:color="cbd5e1" w:space="0" w:sz="4" w:val="single"/>
+              <w:right w:color="cbd5e1" w:space="0" w:sz="4" w:val="single"/>
+            </w:tcBorders>
+            <w:shd w:fill="ffffff" w:val="clear"/>
+            <w:tcMar>
+              <w:top w:w="80.0" w:type="dxa"/>
+              <w:left w:w="120.0" w:type="dxa"/>
+              <w:bottom w:w="80.0" w:type="dxa"/>
+              <w:right w:w="120.0" w:type="dxa"/>
+            </w:tcMar>
+          </w:tcPr>
+          <w:p>
+            <w:pPr>
+              <w:spacing w:after="0" w:lineRule="auto"/>
+              <w:rPr/>
+            </w:pPr>
+            <w:r>
+              <w:rPr>
+                <w:rFonts w:ascii="Arial" w:cs="Arial" w:eastAsia="Arial" w:hAnsi="Arial"/>
+                <w:b w:val="0"/>
+                <w:bCs w:val="0"/>
+                <w:color w:val="374151"/>
+                <w:sz w:val="18"/>
+                <w:szCs w:val="18"/>
+                <w:rtl w:val="0"/>
+              </w:rPr>
+              <w:t xml:space="preserve">HEC Paris AI Hallucination Cases Database (Charlotin)</w:t>
+            </w:r>
+            <w:r>
+              <w:rPr>
+                <w:rtl w:val="0"/>
+              </w:rPr>
+            </w:r>
+          </w:p>
+        </w:tc>
+        <w:tc>
+          <w:tcPr>
+            <w:tcBorders>
+              <w:top w:color="cbd5e1" w:space="0" w:sz="4" w:val="single"/>
+              <w:left w:color="cbd5e1" w:space="0" w:sz="4" w:val="single"/>
+              <w:bottom w:color="cbd5e1" w:space="0" w:sz="4" w:val="single"/>
+              <w:right w:color="cbd5e1" w:space="0" w:sz="4" w:val="single"/>
+            </w:tcBorders>
+            <w:shd w:fill="ffffff" w:val="clear"/>
+            <w:tcMar>
+              <w:top w:w="80.0" w:type="dxa"/>
+              <w:left w:w="120.0" w:type="dxa"/>
+              <w:bottom w:w="80.0" w:type="dxa"/>
+              <w:right w:w="120.0" w:type="dxa"/>
+            </w:tcMar>
+          </w:tcPr>
+          <w:p>
+            <w:pPr>
+              <w:spacing w:after="0" w:lineRule="auto"/>
+              <w:rPr/>
+            </w:pPr>
+            <w:hyperlink r:id="rId74">
+              <w:r>
+                <w:rPr>
+                  <w:rFonts w:ascii="Arial" w:cs="Arial" w:eastAsia="Arial" w:hAnsi="Arial"/>
+                  <w:color w:val="1a56db"/>
+                  <w:sz w:val="20"/>
+                  <w:szCs w:val="20"/>
+                  <w:u w:val="single"/>
+                  <w:rtl w:val="0"/>
+                </w:rPr>
+                <w:t xml:space="preserve">damiencharlotin.com/hallucinations/</w:t>
+              </w:r>
+            </w:hyperlink>
+            <w:r>
+              <w:rPr>
+                <w:rtl w:val="0"/>
+              </w:rPr>
+            </w:r>
+          </w:p>
+        </w:tc>
+        <w:tc>
+          <w:tcPr>
+            <w:tcBorders>
+              <w:top w:color="cbd5e1" w:space="0" w:sz="4" w:val="single"/>
+              <w:left w:color="cbd5e1" w:space="0" w:sz="4" w:val="single"/>
+              <w:bottom w:color="cbd5e1" w:space="0" w:sz="4" w:val="single"/>
+              <w:right w:color="cbd5e1" w:space="0" w:sz="4" w:val="single"/>
+            </w:tcBorders>
+            <w:shd w:fill="ffffff" w:val="clear"/>
+            <w:tcMar>
+              <w:top w:w="80.0" w:type="dxa"/>
+              <w:left w:w="120.0" w:type="dxa"/>
+              <w:bottom w:w="80.0" w:type="dxa"/>
+              <w:right w:w="120.0" w:type="dxa"/>
+            </w:tcMar>
+          </w:tcPr>
+          <w:p>
+            <w:pPr>
+              <w:spacing w:after="0" w:lineRule="auto"/>
+              <w:rPr/>
+            </w:pPr>
+            <w:r>
+              <w:rPr>
+                <w:rFonts w:ascii="Arial" w:cs="Arial" w:eastAsia="Arial" w:hAnsi="Arial"/>
+                <w:b w:val="0"/>
+                <w:bCs w:val="0"/>
+                <w:color w:val="374151"/>
+                <w:sz w:val="18"/>
+                <w:szCs w:val="18"/>
+                <w:rtl w:val="0"/>
+              </w:rPr>
+              <w:t xml:space="preserve">Primary source for 1,200+ court sanctions figure (1,275 cases as of April 2026; ~800 from US courts). Maintained by Damien Charlotin (HEC Paris). Covers hallucinated citations and AI-generated filing errors resulting in judicial sanction. As reported by NPR, April 3, 2026.</w:t>
             </w:r>
             <w:r>
               <w:rPr>

</xml_diff>

<commit_message>
docs: The document is internally consistent: 280× is used throughout the body, the Section 8.6 note explains why other sources cite 1,000×, and readers in 4.3 are pointed directly to that note if they want the full context.
</commit_message>
<xml_diff>
--- a/public/AI-Strategic-Brief-V2-Data.docx
+++ b/public/AI-Strategic-Brief-V2-Data.docx
@@ -8739,7 +8739,7 @@
           <w:vertAlign w:val="baseline"/>
           <w:rtl w:val="0"/>
         </w:rPr>
-        <w:t xml:space="preserve">Inference costs have fallen roughly 1,000× in three years (late 2022 to April 2026), equivalent to approximately 10× per year for a given level of benchmark performance. The rate varies by task type — 9× to 900× per year depending on the benchmark — with the fastest drops concentrated in the past 12 months (Sources: Epoch AI; “The Price of Progress”, NeurIPS 2025). The cost of running 5 verification passes today equals the cost of 1 pass 18 months ago.</w:t>
+        <w:t xml:space="preserve">Inference costs have fallen over 280× since late 2022 (Stanford AI Index; see Section 8.6 for methodology note), equivalent to approximately 10× per year for a given level of benchmark performance. The rate varies by task type — 9× to 900× per year depending on the benchmark — with the fastest drops concentrated in the past 12 months (Sources: Epoch AI; “The Price of Progress”, NeurIPS 2025). The cost of running 5 verification passes today equals the cost of 1 pass 18 months ago.</w:t>
       </w:r>
       <w:r>
         <w:rPr>
@@ -30285,6 +30285,26 @@
               <w:rPr>
                 <w:rtl w:val="0"/>
               </w:rPr>
+            </w:r>
+          </w:p>
+          <w:p>
+            <w:pPr>
+              <w:spacing w:after="0" w:lineRule="auto"/>
+              <w:rPr/>
+            </w:pPr>
+            <w:r>
+              <w:rPr>
+                <w:rFonts w:ascii="Arial" w:cs="Arial" w:eastAsia="Arial" w:hAnsi="Arial"/>
+                <w:i w:val="1"/>
+                <w:iCs w:val="1"/>
+                <w:b w:val="0"/>
+                <w:bCs w:val="0"/>
+                <w:color w:val="374151"/>
+                <w:sz w:val="18"/>
+                <w:szCs w:val="18"/>
+                <w:rtl w:val="0"/>
+              </w:rPr>
+              <w:t xml:space="preserve">Note: The 280× figure measures cost to achieve GPT-3.5-level MMLU performance, from $20 to $0.07 per million tokens, November 2022 to October 2024. Some sources cite 1,000× using a longer window or broader methodology. This report uses the Stanford-sourced 280× figure throughout for consistency.</w:t>
             </w:r>
           </w:p>
         </w:tc>

</xml_diff>